<commit_message>
Update entete.docx: fix pictogram alignment with address lines
</commit_message>
<xml_diff>
--- a/sources/extra_files/app/entete.docx
+++ b/sources/extra_files/app/entete.docx
@@ -9,173 +9,21 @@
       </w:pPr>
       <w:r>
         <w:rPr/>
-      </w:r>
-    </w:p>
-    <w:p>
-      <w:pPr>
-        <w:pStyle w:val="Header"/>
-        <w:rPr>
-          <w:rFonts w:ascii="Verdana" w:hAnsi="Verdana" w:cs="Arial"/>
-        </w:rPr>
-      </w:pPr>
-      <w:r>
-        <w:rPr>
-          <w:rFonts w:cs="Arial" w:ascii="Verdana" w:hAnsi="Verdana"/>
-        </w:rPr>
         <mc:AlternateContent>
           <mc:Choice Requires="wps">
             <w:drawing>
-              <wp:anchor distT="0" distB="5080" distL="0" distR="0" simplePos="0" relativeHeight="2" behindDoc="0" locked="0" layoutInCell="0" allowOverlap="1" wp14:anchorId="7B082D36">
+              <wp:anchor distT="0" distB="0" distL="0" distR="0" simplePos="0" relativeHeight="4" behindDoc="0" locked="0" layoutInCell="1" allowOverlap="1" wp14:anchorId="72E36BFD">
                 <wp:simplePos x="0" y="0"/>
-                <wp:positionH relativeFrom="margin">
-                  <wp:align>center</wp:align>
+                <wp:positionH relativeFrom="column">
+                  <wp:posOffset>4285615</wp:posOffset>
                 </wp:positionH>
                 <wp:positionV relativeFrom="paragraph">
-                  <wp:posOffset>-784860</wp:posOffset>
-                </wp:positionV>
-                <wp:extent cx="7086600" cy="1709420"/>
-                <wp:effectExtent l="0" t="0" r="0" b="5080"/>
-                <wp:wrapNone/>
-                <wp:docPr id="1" name="Rectangle : coins arrondis 8"/>
-                <a:graphic xmlns:a="http://schemas.openxmlformats.org/drawingml/2006/main">
-                  <a:graphicData uri="http://schemas.microsoft.com/office/word/2010/wordprocessingShape">
-                    <wps:wsp>
-                      <wps:cNvSpPr/>
-                      <wps:spPr>
-                        <a:xfrm>
-                          <a:off x="0" y="0"/>
-                          <a:ext cx="7086600" cy="1709280"/>
-                        </a:xfrm>
-                        <a:prstGeom prst="roundRect">
-                          <a:avLst>
-                            <a:gd name="adj" fmla="val 16667"/>
-                          </a:avLst>
-                        </a:prstGeom>
-                        <a:solidFill>
-                          <a:schemeClr val="tx2">
-                            <a:lumMod val="10000"/>
-                            <a:lumOff val="90000"/>
-                          </a:schemeClr>
-                        </a:solidFill>
-                        <a:ln>
-                          <a:noFill/>
-                        </a:ln>
-                      </wps:spPr>
-                      <wps:style>
-                        <a:lnRef idx="2">
-                          <a:schemeClr val="accent1">
-                            <a:shade val="15000"/>
-                          </a:schemeClr>
-                        </a:lnRef>
-                        <a:fillRef idx="1">
-                          <a:schemeClr val="accent1"/>
-                        </a:fillRef>
-                        <a:effectRef idx="0">
-                          <a:schemeClr val="accent1"/>
-                        </a:effectRef>
-                        <a:fontRef idx="minor"/>
-                      </wps:style>
-                      <wps:txbx>
-                        <w:txbxContent>
-                          <w:p>
-                            <w:pPr>
-                              <w:pStyle w:val="Header"/>
-                              <w:rPr>
-                                <w:rFonts w:ascii="Verdana" w:hAnsi="Verdana" w:cs="Arial"/>
-                              </w:rPr>
-                            </w:pPr>
-                            <w:r>
-                              <w:rPr>
-                                <w:rFonts w:cs="Arial" w:ascii="Verdana" w:hAnsi="Verdana"/>
-                                <w:color w:val="FFFFFF"/>
-                              </w:rPr>
-                            </w:r>
-                          </w:p>
-                          <w:p>
-                            <w:pPr>
-                              <w:pStyle w:val="FrameContents"/>
-                              <w:spacing w:before="0" w:after="160"/>
-                              <w:jc w:val="center"/>
-                              <w:rPr>
-                                <w:color w:val="FFFFFF"/>
-                              </w:rPr>
-                            </w:pPr>
-                            <w:r>
-                              <w:rPr>
-                                <w:color w:val="FFFFFF"/>
-                              </w:rPr>
-                            </w:r>
-                          </w:p>
-                        </w:txbxContent>
-                      </wps:txbx>
-                      <wps:bodyPr anchor="ctr">
-                        <a:prstTxWarp prst="textNoShape"/>
-                        <a:noAutofit/>
-                      </wps:bodyPr>
-                    </wps:wsp>
-                  </a:graphicData>
-                </a:graphic>
-              </wp:anchor>
-            </w:drawing>
-          </mc:Choice>
-          <mc:Fallback>
-            <w:pict>
-              <v:roundrect id="shape_0" fillcolor="#dceaf7" stroked="f" o:allowincell="f" style="position:absolute;margin-left:-52.2pt;margin-top:-61.8pt;width:557.95pt;height:134.55pt;mso-wrap-style:square;v-text-anchor:middle;mso-position-horizontal:center;mso-position-horizontal-relative:margin" wp14:anchorId="7B082D36">
-                <v:fill o:detectmouseclick="t" type="solid" color2="#231508"/>
-                <v:stroke color="#3465a4" weight="12600" joinstyle="miter" endcap="flat"/>
-                <v:textbox>
-                  <w:txbxContent>
-                    <w:p>
-                      <w:pPr>
-                        <w:pStyle w:val="Header"/>
-                        <w:rPr>
-                          <w:rFonts w:ascii="Verdana" w:hAnsi="Verdana" w:cs="Arial"/>
-                        </w:rPr>
-                      </w:pPr>
-                      <w:r>
-                        <w:rPr>
-                          <w:rFonts w:cs="Arial" w:ascii="Verdana" w:hAnsi="Verdana"/>
-                          <w:color w:val="FFFFFF"/>
-                        </w:rPr>
-                      </w:r>
-                    </w:p>
-                    <w:p>
-                      <w:pPr>
-                        <w:pStyle w:val="FrameContents"/>
-                        <w:spacing w:before="0" w:after="160"/>
-                        <w:jc w:val="center"/>
-                        <w:rPr>
-                          <w:color w:val="FFFFFF"/>
-                        </w:rPr>
-                      </w:pPr>
-                      <w:r>
-                        <w:rPr>
-                          <w:color w:val="FFFFFF"/>
-                        </w:rPr>
-                      </w:r>
-                    </w:p>
-                  </w:txbxContent>
-                </v:textbox>
-                <w10:wrap type="none"/>
-              </v:roundrect>
-            </w:pict>
-          </mc:Fallback>
-        </mc:AlternateContent>
-        <mc:AlternateContent>
-          <mc:Choice Requires="wps">
-            <w:drawing>
-              <wp:anchor distT="0" distB="0" distL="0" distR="0" simplePos="0" relativeHeight="4" behindDoc="0" locked="0" layoutInCell="0" allowOverlap="1" wp14:anchorId="72E36BFD">
-                <wp:simplePos x="0" y="0"/>
-                <wp:positionH relativeFrom="margin">
-                  <wp:posOffset>4283710</wp:posOffset>
-                </wp:positionH>
-                <wp:positionV relativeFrom="paragraph">
-                  <wp:posOffset>-804545</wp:posOffset>
+                  <wp:posOffset>-597535</wp:posOffset>
                 </wp:positionV>
                 <wp:extent cx="2202180" cy="1860550"/>
                 <wp:effectExtent l="0" t="0" r="0" b="0"/>
                 <wp:wrapNone/>
-                <wp:docPr id="2" name="Rectangle 1"/>
+                <wp:docPr id="1" name="Rectangle 1"/>
                 <a:graphic xmlns:a="http://schemas.openxmlformats.org/drawingml/2006/main">
                   <a:graphicData uri="http://schemas.microsoft.com/office/word/2010/wordprocessingShape">
                     <wps:wsp>
@@ -221,20 +69,6 @@
                                 <w:color w:themeColor="text1" w:val="000000"/>
                               </w:rPr>
                               <w:t>130, Boulevard de la Paix</w:t>
-                            </w:r>
-                          </w:p>
-                          <w:p>
-                            <w:pPr>
-                              <w:pStyle w:val="Header"/>
-                              <w:rPr>
-                                <w:color w:themeColor="text1" w:val="000000"/>
-                              </w:rPr>
-                            </w:pPr>
-                            <w:r>
-                              <w:rPr>
-                                <w:color w:themeColor="text1" w:val="000000"/>
-                              </w:rPr>
-                              <w:t>Résidence les jardinières</w:t>
                             </w:r>
                           </w:p>
                           <w:p>
@@ -304,18 +138,14 @@
                           <w:p>
                             <w:pPr>
                               <w:pStyle w:val="NoSpacing"/>
-                              <w:rPr>
-                                <w:color w:themeColor="text1" w:val="000000"/>
-                                <w:sz w:val="20"/>
-                                <w:szCs w:val="20"/>
-                              </w:rPr>
+                              <w:rPr/>
                             </w:pPr>
                             <w:hyperlink r:id="rId2">
                               <w:r>
                                 <w:rPr>
                                   <w:rStyle w:val="Hyperlink"/>
-                                  <w:sz w:val="20"/>
-                                  <w:szCs w:val="20"/>
+                                  <w:sz w:val="18"/>
+                                  <w:szCs w:val="18"/>
                                 </w:rPr>
                                 <w:t>orthoptistes-yssingeaux@outlook.fr</w:t>
                               </w:r>
@@ -323,8 +153,8 @@
                           </w:p>
                           <w:p>
                             <w:pPr>
-                              <w:pStyle w:val="FrameContents"/>
-                              <w:spacing w:before="0" w:after="160"/>
+                              <w:pStyle w:val="FrameContentsuser"/>
+                              <w:spacing w:before="0" w:after="0"/>
                               <w:jc w:val="center"/>
                               <w:rPr>
                                 <w:color w:themeColor="text1" w:val="000000"/>
@@ -334,7 +164,23 @@
                               <w:rPr>
                                 <w:color w:themeColor="text1" w:val="000000"/>
                               </w:rPr>
-                              <w:t>Prise de rendez-vous sur Doctolib</w:t>
+                              <w:t xml:space="preserve">Prise de rendez-vous </w:t>
+                            </w:r>
+                          </w:p>
+                          <w:p>
+                            <w:pPr>
+                              <w:pStyle w:val="FrameContentsuser"/>
+                              <w:spacing w:before="0" w:after="0"/>
+                              <w:jc w:val="center"/>
+                              <w:rPr>
+                                <w:color w:themeColor="text1" w:val="000000"/>
+                              </w:rPr>
+                            </w:pPr>
+                            <w:r>
+                              <w:rPr>
+                                <w:color w:themeColor="text1" w:val="000000"/>
+                              </w:rPr>
+                              <w:t>sur Doctolib</w:t>
                             </w:r>
                           </w:p>
                         </w:txbxContent>
@@ -351,7 +197,7 @@
           </mc:Choice>
           <mc:Fallback>
             <w:pict>
-              <v:rect id="shape_0" stroked="f" o:allowincell="f" style="position:absolute;margin-left:337.3pt;margin-top:-63.35pt;width:173.35pt;height:146.45pt;mso-wrap-style:square;v-text-anchor:middle;mso-position-horizontal-relative:margin" wp14:anchorId="72E36BFD">
+              <v:rect id="shape_0" stroked="f" o:allowincell="f" style="position:absolute;margin-left:337.45pt;margin-top:-47.05pt;width:173.35pt;height:146.45pt;mso-wrap-style:square;v-text-anchor:middle" wp14:anchorId="72E36BFD">
                 <v:fill o:detectmouseclick="t" on="false"/>
                 <v:stroke color="#3465a4" weight="12600" joinstyle="miter" endcap="flat"/>
                 <v:textbox>
@@ -368,20 +214,6 @@
                           <w:color w:themeColor="text1" w:val="000000"/>
                         </w:rPr>
                         <w:t>130, Boulevard de la Paix</w:t>
-                      </w:r>
-                    </w:p>
-                    <w:p>
-                      <w:pPr>
-                        <w:pStyle w:val="Header"/>
-                        <w:rPr>
-                          <w:color w:themeColor="text1" w:val="000000"/>
-                        </w:rPr>
-                      </w:pPr>
-                      <w:r>
-                        <w:rPr>
-                          <w:color w:themeColor="text1" w:val="000000"/>
-                        </w:rPr>
-                        <w:t>Résidence les jardinières</w:t>
                       </w:r>
                     </w:p>
                     <w:p>
@@ -451,18 +283,14 @@
                     <w:p>
                       <w:pPr>
                         <w:pStyle w:val="NoSpacing"/>
-                        <w:rPr>
-                          <w:color w:themeColor="text1" w:val="000000"/>
-                          <w:sz w:val="20"/>
-                          <w:szCs w:val="20"/>
-                        </w:rPr>
+                        <w:rPr/>
                       </w:pPr>
                       <w:hyperlink r:id="rId3">
                         <w:r>
                           <w:rPr>
                             <w:rStyle w:val="Hyperlink"/>
-                            <w:sz w:val="20"/>
-                            <w:szCs w:val="20"/>
+                            <w:sz w:val="18"/>
+                            <w:szCs w:val="18"/>
                           </w:rPr>
                           <w:t>orthoptistes-yssingeaux@outlook.fr</w:t>
                         </w:r>
@@ -470,8 +298,8 @@
                     </w:p>
                     <w:p>
                       <w:pPr>
-                        <w:pStyle w:val="FrameContents"/>
-                        <w:spacing w:before="0" w:after="160"/>
+                        <w:pStyle w:val="FrameContentsuser"/>
+                        <w:spacing w:before="0" w:after="0"/>
                         <w:jc w:val="center"/>
                         <w:rPr>
                           <w:color w:themeColor="text1" w:val="000000"/>
@@ -481,13 +309,181 @@
                         <w:rPr>
                           <w:color w:themeColor="text1" w:val="000000"/>
                         </w:rPr>
-                        <w:t>Prise de rendez-vous sur Doctolib</w:t>
+                        <w:t xml:space="preserve">Prise de rendez-vous </w:t>
+                      </w:r>
+                    </w:p>
+                    <w:p>
+                      <w:pPr>
+                        <w:pStyle w:val="FrameContentsuser"/>
+                        <w:spacing w:before="0" w:after="0"/>
+                        <w:jc w:val="center"/>
+                        <w:rPr>
+                          <w:color w:themeColor="text1" w:val="000000"/>
+                        </w:rPr>
+                      </w:pPr>
+                      <w:r>
+                        <w:rPr>
+                          <w:color w:themeColor="text1" w:val="000000"/>
+                        </w:rPr>
+                        <w:t>sur Doctolib</w:t>
                       </w:r>
                     </w:p>
                   </w:txbxContent>
                 </v:textbox>
                 <w10:wrap type="none"/>
               </v:rect>
+            </w:pict>
+          </mc:Fallback>
+        </mc:AlternateContent>
+      </w:r>
+    </w:p>
+    <w:p>
+      <w:pPr>
+        <w:pStyle w:val="Header"/>
+        <w:rPr>
+          <w:rFonts w:ascii="Verdana" w:hAnsi="Verdana" w:cs="Arial"/>
+        </w:rPr>
+      </w:pPr>
+      <w:r>
+        <w:rPr>
+          <w:rFonts w:cs="Arial" w:ascii="Verdana" w:hAnsi="Verdana"/>
+        </w:rPr>
+        <mc:AlternateContent>
+          <mc:Choice Requires="wps">
+            <w:drawing>
+              <wp:anchor distT="0" distB="5080" distL="0" distR="0" simplePos="0" relativeHeight="2" behindDoc="0" locked="0" layoutInCell="0" allowOverlap="1" wp14:anchorId="7B082D36">
+                <wp:simplePos x="0" y="0"/>
+                <wp:positionH relativeFrom="margin">
+                  <wp:align>center</wp:align>
+                </wp:positionH>
+                <wp:positionV relativeFrom="paragraph">
+                  <wp:posOffset>-784860</wp:posOffset>
+                </wp:positionV>
+                <wp:extent cx="7086600" cy="1709420"/>
+                <wp:effectExtent l="0" t="0" r="0" b="5080"/>
+                <wp:wrapNone/>
+                <wp:docPr id="2" name="Rectangle : coins arrondis 8"/>
+                <a:graphic xmlns:a="http://schemas.openxmlformats.org/drawingml/2006/main">
+                  <a:graphicData uri="http://schemas.microsoft.com/office/word/2010/wordprocessingShape">
+                    <wps:wsp>
+                      <wps:cNvSpPr/>
+                      <wps:spPr>
+                        <a:xfrm>
+                          <a:off x="0" y="0"/>
+                          <a:ext cx="7086600" cy="1709280"/>
+                        </a:xfrm>
+                        <a:prstGeom prst="roundRect">
+                          <a:avLst>
+                            <a:gd name="adj" fmla="val 16667"/>
+                          </a:avLst>
+                        </a:prstGeom>
+                        <a:solidFill>
+                          <a:schemeClr val="tx2">
+                            <a:lumMod val="10000"/>
+                            <a:lumOff val="90000"/>
+                          </a:schemeClr>
+                        </a:solidFill>
+                        <a:ln>
+                          <a:noFill/>
+                        </a:ln>
+                      </wps:spPr>
+                      <wps:style>
+                        <a:lnRef idx="2">
+                          <a:schemeClr val="accent1">
+                            <a:shade val="15000"/>
+                          </a:schemeClr>
+                        </a:lnRef>
+                        <a:fillRef idx="1">
+                          <a:schemeClr val="accent1"/>
+                        </a:fillRef>
+                        <a:effectRef idx="0">
+                          <a:schemeClr val="accent1"/>
+                        </a:effectRef>
+                        <a:fontRef idx="minor"/>
+                      </wps:style>
+                      <wps:txbx>
+                        <w:txbxContent>
+                          <w:p>
+                            <w:pPr>
+                              <w:pStyle w:val="Header"/>
+                              <w:rPr>
+                                <w:rFonts w:ascii="Verdana" w:hAnsi="Verdana" w:cs="Arial"/>
+                              </w:rPr>
+                            </w:pPr>
+                            <w:r>
+                              <w:rPr>
+                                <w:rFonts w:cs="Arial" w:ascii="Verdana" w:hAnsi="Verdana"/>
+                                <w:color w:val="000000"/>
+                              </w:rPr>
+                            </w:r>
+                          </w:p>
+                          <w:p>
+                            <w:pPr>
+                              <w:pStyle w:val="FrameContentsuser"/>
+                              <w:spacing w:before="0" w:after="160"/>
+                              <w:jc w:val="center"/>
+                              <w:rPr>
+                                <w:color w:val="FFFFFF"/>
+                              </w:rPr>
+                            </w:pPr>
+                            <w:r>
+                              <w:rPr>
+                                <w:color w:val="000000"/>
+                              </w:rPr>
+                            </w:r>
+                          </w:p>
+                        </w:txbxContent>
+                      </wps:txbx>
+                      <wps:bodyPr anchor="ctr">
+                        <a:prstTxWarp prst="textNoShape"/>
+                        <a:noAutofit/>
+                      </wps:bodyPr>
+                    </wps:wsp>
+                  </a:graphicData>
+                </a:graphic>
+              </wp:anchor>
+            </w:drawing>
+          </mc:Choice>
+          <mc:Fallback>
+            <w:pict>
+              <v:roundrect id="shape_0" fillcolor="#dceaf7" stroked="f" o:allowincell="f" style="position:absolute;margin-left:-52.2pt;margin-top:-61.8pt;width:557.95pt;height:134.55pt;mso-wrap-style:square;v-text-anchor:middle;mso-position-horizontal:center;mso-position-horizontal-relative:margin" wp14:anchorId="7B082D36">
+                <v:fill o:detectmouseclick="t" type="solid" color2="#231508"/>
+                <v:stroke color="#3465a4" weight="12600" joinstyle="miter" endcap="flat"/>
+                <v:textbox>
+                  <w:txbxContent>
+                    <w:p>
+                      <w:pPr>
+                        <w:pStyle w:val="Header"/>
+                        <w:rPr>
+                          <w:rFonts w:ascii="Verdana" w:hAnsi="Verdana" w:cs="Arial"/>
+                        </w:rPr>
+                      </w:pPr>
+                      <w:r>
+                        <w:rPr>
+                          <w:rFonts w:cs="Arial" w:ascii="Verdana" w:hAnsi="Verdana"/>
+                          <w:color w:val="000000"/>
+                        </w:rPr>
+                      </w:r>
+                    </w:p>
+                    <w:p>
+                      <w:pPr>
+                        <w:pStyle w:val="FrameContentsuser"/>
+                        <w:spacing w:before="0" w:after="160"/>
+                        <w:jc w:val="center"/>
+                        <w:rPr>
+                          <w:color w:val="FFFFFF"/>
+                        </w:rPr>
+                      </w:pPr>
+                      <w:r>
+                        <w:rPr>
+                          <w:color w:val="000000"/>
+                        </w:rPr>
+                      </w:r>
+                    </w:p>
+                  </w:txbxContent>
+                </v:textbox>
+                <w10:wrap type="none"/>
+              </v:roundrect>
             </w:pict>
           </mc:Fallback>
         </mc:AlternateContent>
@@ -646,6 +642,7 @@
                             <w:r>
                               <w:rPr>
                                 <w:rFonts w:cs="Arial" w:ascii="Verdana" w:hAnsi="Verdana"/>
+                                <w:color w:val="000000"/>
                                 <w:sz w:val="32"/>
                                 <w:szCs w:val="32"/>
                               </w:rPr>
@@ -654,6 +651,7 @@
                             <w:r>
                               <w:rPr>
                                 <w:rFonts w:cs="Arial" w:ascii="Verdana" w:hAnsi="Verdana"/>
+                                <w:color w:val="000000"/>
                                 <w:sz w:val="40"/>
                                 <w:szCs w:val="40"/>
                               </w:rPr>
@@ -673,6 +671,7 @@
                             <w:r>
                               <w:rPr>
                                 <w:rFonts w:cs="Arial" w:ascii="Verdana" w:hAnsi="Verdana"/>
+                                <w:color w:val="000000"/>
                                 <w:sz w:val="32"/>
                                 <w:szCs w:val="32"/>
                               </w:rPr>
@@ -681,12 +680,16 @@
                           </w:p>
                           <w:p>
                             <w:pPr>
-                              <w:pStyle w:val="FrameContents"/>
+                              <w:pStyle w:val="FrameContentsuser"/>
                               <w:spacing w:before="0" w:after="160"/>
-                              <w:rPr/>
+                              <w:rPr>
+                                <w:color w:val="000000"/>
+                              </w:rPr>
                             </w:pPr>
                             <w:r>
-                              <w:rPr/>
+                              <w:rPr>
+                                <w:color w:val="000000"/>
+                              </w:rPr>
                             </w:r>
                           </w:p>
                         </w:txbxContent>
@@ -719,6 +722,7 @@
                       <w:r>
                         <w:rPr>
                           <w:rFonts w:cs="Arial" w:ascii="Verdana" w:hAnsi="Verdana"/>
+                          <w:color w:val="000000"/>
                           <w:sz w:val="32"/>
                           <w:szCs w:val="32"/>
                         </w:rPr>
@@ -727,6 +731,7 @@
                       <w:r>
                         <w:rPr>
                           <w:rFonts w:cs="Arial" w:ascii="Verdana" w:hAnsi="Verdana"/>
+                          <w:color w:val="000000"/>
                           <w:sz w:val="40"/>
                           <w:szCs w:val="40"/>
                         </w:rPr>
@@ -746,6 +751,7 @@
                       <w:r>
                         <w:rPr>
                           <w:rFonts w:cs="Arial" w:ascii="Verdana" w:hAnsi="Verdana"/>
+                          <w:color w:val="000000"/>
                           <w:sz w:val="32"/>
                           <w:szCs w:val="32"/>
                         </w:rPr>
@@ -754,12 +760,16 @@
                     </w:p>
                     <w:p>
                       <w:pPr>
-                        <w:pStyle w:val="FrameContents"/>
+                        <w:pStyle w:val="FrameContentsuser"/>
                         <w:spacing w:before="0" w:after="160"/>
-                        <w:rPr/>
+                        <w:rPr>
+                          <w:color w:val="000000"/>
+                        </w:rPr>
                       </w:pPr>
                       <w:r>
-                        <w:rPr/>
+                        <w:rPr>
+                          <w:color w:val="000000"/>
+                        </w:rPr>
                       </w:r>
                     </w:p>
                   </w:txbxContent>
@@ -820,6 +830,7 @@
                             <w:r>
                               <w:rPr>
                                 <w:rFonts w:cs="Arial" w:ascii="Verdana" w:hAnsi="Verdana"/>
+                                <w:color w:val="000000"/>
                               </w:rPr>
                               <w:t>ADELI : 439287145</w:t>
                             </w:r>
@@ -835,18 +846,23 @@
                             <w:r>
                               <w:rPr>
                                 <w:rFonts w:cs="Arial" w:ascii="Verdana" w:hAnsi="Verdana"/>
+                                <w:color w:val="000000"/>
                               </w:rPr>
                               <w:t>RPPS : 10010253291</w:t>
                             </w:r>
                           </w:p>
                           <w:p>
                             <w:pPr>
-                              <w:pStyle w:val="FrameContents"/>
+                              <w:pStyle w:val="FrameContentsuser"/>
                               <w:spacing w:before="0" w:after="160"/>
-                              <w:rPr/>
+                              <w:rPr>
+                                <w:color w:val="000000"/>
+                              </w:rPr>
                             </w:pPr>
                             <w:r>
-                              <w:rPr/>
+                              <w:rPr>
+                                <w:color w:val="000000"/>
+                              </w:rPr>
                             </w:r>
                           </w:p>
                         </w:txbxContent>
@@ -879,6 +895,7 @@
                       <w:r>
                         <w:rPr>
                           <w:rFonts w:cs="Arial" w:ascii="Verdana" w:hAnsi="Verdana"/>
+                          <w:color w:val="000000"/>
                         </w:rPr>
                         <w:t>ADELI : 439287145</w:t>
                       </w:r>
@@ -894,18 +911,23 @@
                       <w:r>
                         <w:rPr>
                           <w:rFonts w:cs="Arial" w:ascii="Verdana" w:hAnsi="Verdana"/>
+                          <w:color w:val="000000"/>
                         </w:rPr>
                         <w:t>RPPS : 10010253291</w:t>
                       </w:r>
                     </w:p>
                     <w:p>
                       <w:pPr>
-                        <w:pStyle w:val="FrameContents"/>
+                        <w:pStyle w:val="FrameContentsuser"/>
                         <w:spacing w:before="0" w:after="160"/>
-                        <w:rPr/>
+                        <w:rPr>
+                          <w:color w:val="000000"/>
+                        </w:rPr>
                       </w:pPr>
                       <w:r>
-                        <w:rPr/>
+                        <w:rPr>
+                          <w:color w:val="000000"/>
+                        </w:rPr>
                       </w:r>
                     </w:p>
                   </w:txbxContent>
@@ -1768,6 +1790,7 @@
     <w:qFormat/>
     <w:pPr>
       <w:widowControl/>
+      <w:suppressAutoHyphens w:val="true"/>
       <w:bidi w:val="0"/>
       <w:spacing w:lineRule="auto" w:line="278" w:before="0" w:after="160"/>
       <w:jc w:val="start"/>
@@ -2415,18 +2438,26 @@
     <w:rsid w:val="00e16d2d"/>
     <w:pPr>
       <w:widowControl/>
+      <w:suppressAutoHyphens w:val="true"/>
       <w:bidi w:val="0"/>
       <w:spacing w:lineRule="auto" w:line="240" w:before="0" w:after="0"/>
       <w:jc w:val="start"/>
     </w:pPr>
     <w:rPr>
-      <w:rFonts w:ascii="Aptos" w:hAnsi="Aptos" w:asciiTheme="minorHAnsi" w:hAnsiTheme="minorHAnsi" w:eastAsia="Aptos" w:cs=""/>
+      <w:rFonts w:ascii="Aptos" w:hAnsi="Aptos" w:eastAsia="Aptos" w:cs="" w:asciiTheme="minorHAnsi" w:hAnsiTheme="minorHAnsi"/>
       <w:color w:val="auto"/>
       <w:kern w:val="2"/>
       <w:sz w:val="24"/>
       <w:szCs w:val="24"/>
       <w:lang w:val="fr-FR" w:eastAsia="en-US" w:bidi="ar-SA"/>
     </w:rPr>
+  </w:style>
+  <w:style w:type="paragraph" w:styleId="FrameContentsuser">
+    <w:name w:val="Frame Contents (user)"/>
+    <w:basedOn w:val="Normal"/>
+    <w:qFormat/>
+    <w:pPr/>
+    <w:rPr/>
   </w:style>
   <w:style w:type="paragraph" w:styleId="FrameContents">
     <w:name w:val="Frame Contents"/>

</xml_diff>